<commit_message>
Site: TLA attribution, Hieroglyphica Magna rebrand, paper v0.3, footer + dictionary-page updates
- Surface CC BY-SA 4.0 TLA attribution on dictionary.html, research.html,
  TOS.html, about.html; reaffirm proprietary rights over everything else.
- Rebrand the extended-glyph font to 'Hieroglyphica Magna' in prose
  (CSS @font-face identifier unchanged); keep Unicode 'Extended-A' accurate.
- research.html: add TLA reference + provenance paragraph; bump to Draft v0.3.
- Hieroglyphica-paper.docx: matching v0.3 revision.
- Move the donate button into the social row (between Tumblr and LinkedIn)
  on index/about/research/dictionary; add home-page bottom spacing.
- dictionary.html: remove the download; make it a submission page.
</commit_message>
<xml_diff>
--- a/Hieroglyphica-paper.docx
+++ b/Hieroglyphica-paper.docx
@@ -91,7 +91,7 @@
           <w:sz w:val="20"/>
           <w:szCs w:val="20"/>
         </w:rPr>
-        <w:t xml:space="preserve">Draft v0.2 — 28 May 2026</w:t>
+        <w:t xml:space="preserve">Draft v0.3 — 4 June 2026</w:t>
       </w:r>
     </w:p>
     <w:p>
@@ -136,14 +136,7 @@
           <w:sz w:val="20"/>
           <w:szCs w:val="20"/>
         </w:rPr>
-        <w:t xml:space="preserve"> (ΙΕΡΟΓΛΥΦΩ)</w:t>
-      </w:r>
-      <w:r>
-        <w:rPr>
-          <w:sz w:val="20"/>
-          <w:szCs w:val="20"/>
-        </w:rPr>
-        <w:t xml:space="preserve">, a browser-native composition environment for Ancient Egyptian writing, and situates it within the existing landscape of digital epigraphy tools. For two decades the desktop application </w:t>
+        <w:t xml:space="preserve"> (ΙΕΡΟΓΛΥΦΩ), a browser-native composition environment for Ancient Egyptian writing, and situates it within the existing landscape of digital epigraphy tools. For two decades the desktop application </w:t>
       </w:r>
       <w:r>
         <w:rPr>
@@ -182,7 +175,7 @@
           <w:sz w:val="20"/>
           <w:szCs w:val="20"/>
         </w:rPr>
-        <w:t xml:space="preserve">digital epigraphy, Egyptian hieroglyphs, Manuel de Codage, JSesh, Unicode, Leiden conventions, Egyptology, web tools.</w:t>
+        <w:t xml:space="preserve">digital epigraphy, Egyptian hieroglyphs, Manuel de Codage, JSesh, Unicode, Leiden conventions, Thesaurus Linguae Aegyptiae, Egyptology, web tools.</w:t>
       </w:r>
     </w:p>
     <w:p>
@@ -501,10 +494,10 @@
           <w:i/>
           <w:iCs/>
         </w:rPr>
-        <w:t xml:space="preserve">Hieroglyphica Extended</w:t>
-      </w:r>
-      <w:r>
-        <w:t xml:space="preserve"> font for Egyptian Hieroglyphs Extended-A (U+13460–U+143FF), exposing approximately 4,897 additional signs. Because rendering uses standard Unicode codepoints with embedded fonts, the same glyph data passes unchanged through copy, paste, export, and reimport — a property that the proprietary glyph-set approach used by JSesh does not provide.</w:t>
+        <w:t xml:space="preserve">Hieroglyphica Magna</w:t>
+      </w:r>
+      <w:r>
+        <w:t xml:space="preserve"> font — developed by M. Mazzon specifically for this project — for the Egyptian Hieroglyphs Extended-A Unicode block (U+13460–U+143FF), exposing approximately 4,897 additional signs. Because rendering uses standard Unicode codepoints with embedded fonts, the same glyph data passes unchanged through copy, paste, export, and reimport — a property that the proprietary glyph-set approach used by JSesh does not provide.</w:t>
       </w:r>
     </w:p>
     <w:p>
@@ -595,6 +588,15 @@
       </w:pPr>
       <w:r>
         <w:t xml:space="preserve">Glyphs are entered by drag-from-palette, click-to-select, MdC code (with Unicode admitted in the same stream), or by drag from the dictionary search panel. The palette reflows on an auto-fill CSS grid and is drag-resizable.</w:t>
+      </w:r>
+    </w:p>
+    <w:p>
+      <w:pPr>
+        <w:spacing w:after="120" w:line="300"/>
+        <w:jc w:val="both"/>
+      </w:pPr>
+      <w:r>
+        <w:t xml:space="preserve">The dictionary search panel draws on two layers held in separate files. The first is a proprietary Hieroglyphica core compiled by the author (© M. Mazzon, all rights reserved). The second is the Wikidata-linked lemma list of the Thesaurus Linguae Aegyptiae (Berlin-Brandenburgische Akademie der Wissenschaften &amp; Saxon Academy of Sciences and Humanities), reformatted for this tool and redistributed under CC BY-SA 4.0 (Thesaurus Linguae Aegyptiae 2024). The two are aggregated only at runtime, so the ShareAlike obligation is confined to the TLA file and does not reach the software, fonts, or the core. The TLA layer follows the Leiden Unified Transliteration, which the search bridges to the core’s MdC-style transliteration so that a query in either scheme retrieves both.</w:t>
       </w:r>
     </w:p>
     <w:p>
@@ -3131,6 +3133,26 @@
       </w:r>
       <w:r>
         <w:t xml:space="preserve">, ed. C. Graves-Brown. Swansea: Classical Press of Wales.</w:t>
+      </w:r>
+    </w:p>
+    <w:p>
+      <w:pPr>
+        <w:spacing w:after="120" w:line="280"/>
+        <w:ind w:left="360" w:hanging="360"/>
+        <w:jc w:val="left"/>
+      </w:pPr>
+      <w:r>
+        <w:t xml:space="preserve">Thesaurus Linguae Aegyptiae. (2024). </w:t>
+      </w:r>
+      <w:r>
+        <w:rPr>
+          <w:i/>
+          <w:iCs/>
+        </w:rPr>
+        <w:t xml:space="preserve">Hieroglyphic/hieratic lemma list, Wikidata-linked export</w:t>
+      </w:r>
+      <w:r>
+        <w:t xml:space="preserve">. Berlin-Brandenburgische Akademie der Wissenschaften &amp; Saxon Academy of Sciences and Humanities in Leipzig. edoc.bbaw.de, docId 5402. Licensed under CC BY-SA 4.0.</w:t>
       </w:r>
     </w:p>
     <w:p>

</xml_diff>